<commit_message>
Wrote the full Power Block Design chapter. Updated the assignment page (final version)
</commit_message>
<xml_diff>
--- a/Documentation/Z_Iliyan_Antov_101324019.docx
+++ b/Documentation/Z_Iliyan_Antov_101324019.docx
@@ -634,7 +634,7 @@
           <w:b/>
           <w:sz w:val="24"/>
           <w:szCs w:val="24"/>
-          <w:lang w:val="ru-RU"/>
+          <w:lang w:val="bg-BG"/>
         </w:rPr>
         <w:t xml:space="preserve">На </w:t>
       </w:r>
@@ -644,7 +644,7 @@
           <w:b/>
           <w:sz w:val="24"/>
           <w:szCs w:val="24"/>
-          <w:lang w:val="ru-RU"/>
+          <w:lang w:val="bg-BG"/>
         </w:rPr>
         <w:t>дипломанта</w:t>
       </w:r>
@@ -654,7 +654,7 @@
           <w:b/>
           <w:sz w:val="24"/>
           <w:szCs w:val="24"/>
-          <w:lang w:val="ru-RU"/>
+          <w:lang w:val="bg-BG"/>
         </w:rPr>
         <w:t>:</w:t>
       </w:r>
@@ -675,27 +675,7 @@
           <w:szCs w:val="24"/>
           <w:lang w:val="bg-BG"/>
         </w:rPr>
-        <w:t xml:space="preserve">Илиян </w:t>
-      </w:r>
-      <w:proofErr w:type="spellStart"/>
-      <w:r>
-        <w:rPr>
-          <w:rFonts w:ascii="Times New Roman CYR" w:hAnsi="Times New Roman CYR"/>
-          <w:sz w:val="24"/>
-          <w:szCs w:val="24"/>
-          <w:lang w:val="bg-BG"/>
-        </w:rPr>
-        <w:t>Илиянов</w:t>
-      </w:r>
-      <w:proofErr w:type="spellEnd"/>
-      <w:r>
-        <w:rPr>
-          <w:rFonts w:ascii="Times New Roman CYR" w:hAnsi="Times New Roman CYR"/>
-          <w:sz w:val="24"/>
-          <w:szCs w:val="24"/>
-          <w:lang w:val="bg-BG"/>
-        </w:rPr>
-        <w:t xml:space="preserve"> Антов</w:t>
+        <w:t>Илиян Илиянов Антов</w:t>
       </w:r>
     </w:p>
     <w:p>
@@ -714,7 +694,7 @@
           <w:b/>
           <w:sz w:val="24"/>
           <w:szCs w:val="24"/>
-          <w:lang w:val="ru-RU"/>
+          <w:lang w:val="bg-BG"/>
         </w:rPr>
         <w:t>Факултетен номер:</w:t>
       </w:r>
@@ -722,7 +702,7 @@
         <w:rPr>
           <w:sz w:val="24"/>
           <w:szCs w:val="24"/>
-          <w:lang w:val="ru-RU"/>
+          <w:lang w:val="bg-BG"/>
         </w:rPr>
         <w:t xml:space="preserve"> </w:t>
       </w:r>
@@ -777,7 +757,6 @@
           <w:b/>
           <w:sz w:val="24"/>
           <w:szCs w:val="24"/>
-          <w:lang w:val="bg-BG"/>
         </w:rPr>
         <w:t xml:space="preserve">: </w:t>
       </w:r>
@@ -815,7 +794,7 @@
           <w:b/>
           <w:sz w:val="24"/>
           <w:szCs w:val="24"/>
-          <w:lang w:val="ru-RU"/>
+          <w:lang w:val="bg-BG"/>
         </w:rPr>
         <w:t xml:space="preserve">Образователно-квалификационна </w:t>
       </w:r>
@@ -824,7 +803,7 @@
           <w:b/>
           <w:sz w:val="24"/>
           <w:szCs w:val="24"/>
-          <w:lang w:val="ru-RU"/>
+          <w:lang w:val="bg-BG"/>
         </w:rPr>
         <w:t xml:space="preserve">степен: </w:t>
       </w:r>
@@ -854,7 +833,7 @@
           <w:b/>
           <w:sz w:val="24"/>
           <w:szCs w:val="24"/>
-          <w:lang w:val="ru-RU"/>
+          <w:lang w:val="bg-BG"/>
         </w:rPr>
         <w:t>Специалност</w:t>
       </w:r>
@@ -862,17 +841,9 @@
         <w:rPr>
           <w:sz w:val="24"/>
           <w:szCs w:val="24"/>
-          <w:lang w:val="ru-RU"/>
-        </w:rPr>
-        <w:t>:</w:t>
-      </w:r>
-      <w:r>
-        <w:rPr>
-          <w:sz w:val="24"/>
-          <w:szCs w:val="24"/>
-          <w:lang w:val="bg-BG"/>
-        </w:rPr>
-        <w:t xml:space="preserve"> </w:t>
+          <w:lang w:val="bg-BG"/>
+        </w:rPr>
+        <w:t xml:space="preserve">: </w:t>
       </w:r>
       <w:r>
         <w:rPr>
@@ -906,18 +877,9 @@
           <w:b/>
           <w:sz w:val="24"/>
           <w:szCs w:val="24"/>
-          <w:lang w:val="ru-RU"/>
-        </w:rPr>
-        <w:t>1. Тема:</w:t>
-      </w:r>
-      <w:r>
-        <w:rPr>
-          <w:b/>
-          <w:sz w:val="24"/>
-          <w:szCs w:val="24"/>
-          <w:lang w:val="bg-BG"/>
-        </w:rPr>
-        <w:t xml:space="preserve"> </w:t>
+          <w:lang w:val="bg-BG"/>
+        </w:rPr>
+        <w:t xml:space="preserve">1. Тема: </w:t>
       </w:r>
       <w:r>
         <w:rPr>
@@ -934,44 +896,16 @@
           <w:szCs w:val="24"/>
           <w:lang w:val="bg-BG"/>
         </w:rPr>
-        <w:t xml:space="preserve">Управление на </w:t>
-      </w:r>
-      <w:proofErr w:type="spellStart"/>
-      <w:r>
-        <w:rPr>
-          <w:sz w:val="24"/>
-          <w:szCs w:val="24"/>
-          <w:lang w:val="bg-BG"/>
-        </w:rPr>
-        <w:t>безчетков</w:t>
-      </w:r>
-      <w:proofErr w:type="spellEnd"/>
-      <w:r>
-        <w:rPr>
-          <w:sz w:val="24"/>
-          <w:szCs w:val="24"/>
-          <w:lang w:val="bg-BG"/>
-        </w:rPr>
-        <w:t xml:space="preserve"> постояннотоков двигател без разработка на</w:t>
-      </w:r>
-      <w:r>
-        <w:rPr>
-          <w:sz w:val="24"/>
-          <w:szCs w:val="24"/>
-          <w:lang w:val="bg-BG"/>
-        </w:rPr>
-        <w:t xml:space="preserve"> </w:t>
-      </w:r>
-      <w:proofErr w:type="spellStart"/>
-      <w:r>
-        <w:rPr>
-          <w:sz w:val="24"/>
-          <w:szCs w:val="24"/>
-          <w:lang w:val="bg-BG"/>
-        </w:rPr>
-        <w:t>фърмуер</w:t>
-      </w:r>
-      <w:proofErr w:type="spellEnd"/>
+        <w:t xml:space="preserve">Осъвременяване </w:t>
+      </w:r>
+      <w:r>
+        <w:rPr>
+          <w:sz w:val="24"/>
+          <w:szCs w:val="24"/>
+          <w:lang w:val="bg-BG"/>
+        </w:rPr>
+        <w:t>на управлението на вакуумна помпа</w:t>
+      </w:r>
       <w:r>
         <w:rPr>
           <w:sz w:val="24"/>
@@ -1003,7 +937,7 @@
           <w:b/>
           <w:sz w:val="24"/>
           <w:szCs w:val="24"/>
-          <w:lang w:val="ru-RU"/>
+          <w:lang w:val="bg-BG"/>
         </w:rPr>
         <w:t xml:space="preserve">2. </w:t>
       </w:r>
@@ -1013,73 +947,36 @@
           <w:b/>
           <w:sz w:val="24"/>
           <w:szCs w:val="24"/>
-          <w:lang w:val="ru-RU"/>
-        </w:rPr>
-        <w:t>Заявител на темата:</w:t>
-      </w:r>
-      <w:r>
-        <w:rPr>
-          <w:rFonts w:ascii="Times New Roman CYR" w:hAnsi="Times New Roman CYR"/>
-          <w:b/>
-          <w:sz w:val="24"/>
-          <w:szCs w:val="24"/>
-          <w:lang w:val="bg-BG"/>
-        </w:rPr>
-        <w:t xml:space="preserve"> </w:t>
-      </w:r>
-      <w:r>
-        <w:rPr>
-          <w:rFonts w:ascii="Times New Roman CYR" w:hAnsi="Times New Roman CYR"/>
-          <w:sz w:val="24"/>
-          <w:szCs w:val="24"/>
-          <w:lang w:val="bg-BG"/>
-        </w:rPr>
-        <w:t>катедра „Електронна техника“, БТЛ</w:t>
-      </w:r>
-      <w:r>
-        <w:rPr>
-          <w:rFonts w:ascii="Times New Roman CYR" w:hAnsi="Times New Roman CYR"/>
-          <w:sz w:val="24"/>
-          <w:szCs w:val="24"/>
-        </w:rPr>
-        <w:t xml:space="preserve"> </w:t>
-      </w:r>
-      <w:proofErr w:type="spellStart"/>
-      <w:r>
-        <w:rPr>
-          <w:rFonts w:ascii="Times New Roman CYR" w:hAnsi="Times New Roman CYR"/>
-          <w:sz w:val="24"/>
-          <w:szCs w:val="24"/>
-          <w:lang w:val="bg-BG"/>
-        </w:rPr>
-        <w:t>Индъстрийз</w:t>
-      </w:r>
-      <w:proofErr w:type="spellEnd"/>
-      <w:r>
-        <w:rPr>
-          <w:rFonts w:ascii="Times New Roman CYR" w:hAnsi="Times New Roman CYR"/>
-          <w:sz w:val="24"/>
-          <w:szCs w:val="24"/>
-          <w:lang w:val="bg-BG"/>
-        </w:rPr>
-        <w:t xml:space="preserve"> ЕАД</w:t>
-      </w:r>
-    </w:p>
-    <w:p>
-      <w:pPr>
-        <w:rPr>
-          <w:rFonts w:ascii="Times New Roman CYR" w:hAnsi="Times New Roman CYR"/>
-          <w:sz w:val="24"/>
-          <w:szCs w:val="24"/>
-          <w:lang w:val="bg-BG"/>
-        </w:rPr>
-      </w:pPr>
-    </w:p>
-    <w:p>
-      <w:pPr>
-        <w:rPr>
-          <w:sz w:val="24"/>
-          <w:szCs w:val="24"/>
+          <w:lang w:val="bg-BG"/>
+        </w:rPr>
+        <w:t xml:space="preserve">Заявител на темата: </w:t>
+      </w:r>
+      <w:r>
+        <w:rPr>
+          <w:rFonts w:ascii="Times New Roman CYR" w:hAnsi="Times New Roman CYR"/>
+          <w:sz w:val="24"/>
+          <w:szCs w:val="24"/>
+          <w:lang w:val="bg-BG"/>
+        </w:rPr>
+        <w:t>катедра „Електронна техника“, БТЛ Индъстрийз ЕАД</w:t>
+      </w:r>
+    </w:p>
+    <w:p>
+      <w:pPr>
+        <w:rPr>
+          <w:rFonts w:ascii="Times New Roman CYR" w:hAnsi="Times New Roman CYR"/>
+          <w:sz w:val="24"/>
+          <w:szCs w:val="24"/>
+          <w:lang w:val="bg-BG"/>
+        </w:rPr>
+      </w:pPr>
+    </w:p>
+    <w:p>
+      <w:pPr>
+        <w:rPr>
+          <w:sz w:val="24"/>
+          <w:szCs w:val="24"/>
+          <w:lang w:val="bg-BG"/>
         </w:rPr>
       </w:pPr>
       <w:r>
@@ -1110,50 +1007,62 @@
           <w:b/>
           <w:sz w:val="24"/>
           <w:szCs w:val="24"/>
-        </w:rPr>
-      </w:pPr>
-      <w:r>
-        <w:rPr>
-          <w:bCs/>
-          <w:sz w:val="24"/>
-          <w:szCs w:val="24"/>
-          <w:lang w:val="bg-BG"/>
-        </w:rPr>
-        <w:t>Захранващо напрежение</w:t>
-      </w:r>
-      <w:r>
-        <w:rPr>
-          <w:bCs/>
-          <w:sz w:val="24"/>
-          <w:szCs w:val="24"/>
-        </w:rPr>
-        <w:t>:</w:t>
-      </w:r>
-      <w:r>
-        <w:rPr>
-          <w:bCs/>
-          <w:sz w:val="24"/>
-          <w:szCs w:val="24"/>
-          <w:lang w:val="bg-BG"/>
-        </w:rPr>
-        <w:t xml:space="preserve"> </w:t>
-      </w:r>
-      <w:r>
-        <w:rPr>
-          <w:bCs/>
-          <w:sz w:val="24"/>
-          <w:szCs w:val="24"/>
-          <w:lang w:val="bg-BG"/>
-        </w:rPr>
-        <w:t>24</w:t>
-      </w:r>
-      <w:r>
-        <w:rPr>
-          <w:bCs/>
-          <w:sz w:val="24"/>
-          <w:szCs w:val="24"/>
-        </w:rPr>
-        <w:t>V DC</w:t>
+          <w:lang w:val="bg-BG"/>
+        </w:rPr>
+      </w:pPr>
+      <w:r>
+        <w:rPr>
+          <w:bCs/>
+          <w:sz w:val="24"/>
+          <w:szCs w:val="24"/>
+          <w:lang w:val="bg-BG"/>
+        </w:rPr>
+        <w:t xml:space="preserve">Да се проектира </w:t>
+      </w:r>
+      <w:r>
+        <w:rPr>
+          <w:bCs/>
+          <w:sz w:val="24"/>
+          <w:szCs w:val="24"/>
+          <w:lang w:val="bg-BG"/>
+        </w:rPr>
+        <w:t>устройство</w:t>
+      </w:r>
+      <w:r>
+        <w:rPr>
+          <w:bCs/>
+          <w:sz w:val="24"/>
+          <w:szCs w:val="24"/>
+          <w:lang w:val="bg-BG"/>
+        </w:rPr>
+        <w:t xml:space="preserve">, </w:t>
+      </w:r>
+      <w:r>
+        <w:rPr>
+          <w:bCs/>
+          <w:sz w:val="24"/>
+          <w:szCs w:val="24"/>
+          <w:lang w:val="bg-BG"/>
+        </w:rPr>
+        <w:t>ко</w:t>
+      </w:r>
+      <w:r>
+        <w:rPr>
+          <w:bCs/>
+          <w:sz w:val="24"/>
+          <w:szCs w:val="24"/>
+          <w:lang w:val="bg-BG"/>
+        </w:rPr>
+        <w:t>е</w:t>
+      </w:r>
+      <w:r>
+        <w:rPr>
+          <w:bCs/>
+          <w:sz w:val="24"/>
+          <w:szCs w:val="24"/>
+          <w:lang w:val="bg-BG"/>
+        </w:rPr>
+        <w:t>то да замени съществуващо управление</w:t>
       </w:r>
     </w:p>
     <w:p>
@@ -1166,42 +1075,71 @@
           <w:b/>
           <w:sz w:val="24"/>
           <w:szCs w:val="24"/>
-        </w:rPr>
-      </w:pPr>
-      <w:r>
-        <w:rPr>
-          <w:bCs/>
-          <w:sz w:val="24"/>
-          <w:szCs w:val="24"/>
-          <w:lang w:val="bg-BG"/>
-        </w:rPr>
-        <w:t>Максимална мощност на безчетковия мотор</w:t>
-      </w:r>
-      <w:r>
-        <w:rPr>
-          <w:bCs/>
-          <w:sz w:val="24"/>
-          <w:szCs w:val="24"/>
-          <w:lang w:val="bg-BG"/>
-        </w:rPr>
-        <w:t xml:space="preserve">: </w:t>
-      </w:r>
-      <w:r>
-        <w:rPr>
-          <w:bCs/>
-          <w:sz w:val="24"/>
-          <w:szCs w:val="24"/>
-          <w:lang w:val="bg-BG"/>
-        </w:rPr>
-        <w:t>90</w:t>
-      </w:r>
-      <w:r>
-        <w:rPr>
-          <w:bCs/>
-          <w:sz w:val="24"/>
-          <w:szCs w:val="24"/>
-        </w:rPr>
-        <w:t>W</w:t>
+          <w:lang w:val="bg-BG"/>
+        </w:rPr>
+      </w:pPr>
+      <w:r>
+        <w:rPr>
+          <w:bCs/>
+          <w:sz w:val="24"/>
+          <w:szCs w:val="24"/>
+          <w:lang w:val="bg-BG"/>
+        </w:rPr>
+        <w:t xml:space="preserve">Да се анализират </w:t>
+      </w:r>
+      <w:r>
+        <w:rPr>
+          <w:bCs/>
+          <w:sz w:val="24"/>
+          <w:szCs w:val="24"/>
+          <w:lang w:val="bg-BG"/>
+        </w:rPr>
+        <w:t>недостатъци</w:t>
+      </w:r>
+      <w:r>
+        <w:rPr>
+          <w:bCs/>
+          <w:sz w:val="24"/>
+          <w:szCs w:val="24"/>
+          <w:lang w:val="bg-BG"/>
+        </w:rPr>
+        <w:t>те</w:t>
+      </w:r>
+      <w:r>
+        <w:rPr>
+          <w:bCs/>
+          <w:sz w:val="24"/>
+          <w:szCs w:val="24"/>
+          <w:lang w:val="bg-BG"/>
+        </w:rPr>
+        <w:t xml:space="preserve"> на съществуващ</w:t>
+      </w:r>
+      <w:r>
+        <w:rPr>
+          <w:bCs/>
+          <w:sz w:val="24"/>
+          <w:szCs w:val="24"/>
+          <w:lang w:val="bg-BG"/>
+        </w:rPr>
+        <w:t>ата</w:t>
+      </w:r>
+      <w:r>
+        <w:rPr>
+          <w:bCs/>
+          <w:sz w:val="24"/>
+          <w:szCs w:val="24"/>
+          <w:lang w:val="bg-BG"/>
+        </w:rPr>
+        <w:t xml:space="preserve"> </w:t>
+      </w:r>
+      <w:r>
+        <w:rPr>
+          <w:bCs/>
+          <w:sz w:val="24"/>
+          <w:szCs w:val="24"/>
+          <w:lang w:val="bg-BG"/>
+        </w:rPr>
+        <w:t>апаратура</w:t>
       </w:r>
     </w:p>
     <w:p>
@@ -1214,24 +1152,26 @@
           <w:b/>
           <w:sz w:val="24"/>
           <w:szCs w:val="24"/>
-        </w:rPr>
-      </w:pPr>
-      <w:r>
-        <w:rPr>
-          <w:bCs/>
-          <w:sz w:val="24"/>
-          <w:szCs w:val="24"/>
-          <w:lang w:val="bg-BG"/>
-        </w:rPr>
-        <w:t>Допустим обхват от скорости на безчетковия мотор: 200 до 2000</w:t>
-      </w:r>
-      <w:r>
-        <w:rPr>
-          <w:bCs/>
-          <w:sz w:val="24"/>
-          <w:szCs w:val="24"/>
-        </w:rPr>
-        <w:t xml:space="preserve"> RPM</w:t>
+          <w:lang w:val="bg-BG"/>
+        </w:rPr>
+      </w:pPr>
+      <w:r>
+        <w:rPr>
+          <w:bCs/>
+          <w:sz w:val="24"/>
+          <w:szCs w:val="24"/>
+          <w:lang w:val="bg-BG"/>
+        </w:rPr>
+        <w:t xml:space="preserve">Да се състави задание за характеристиките на </w:t>
+      </w:r>
+      <w:r>
+        <w:rPr>
+          <w:bCs/>
+          <w:sz w:val="24"/>
+          <w:szCs w:val="24"/>
+          <w:lang w:val="bg-BG"/>
+        </w:rPr>
+        <w:t>устройството</w:t>
       </w:r>
     </w:p>
     <w:p>
@@ -1244,46 +1184,36 @@
           <w:b/>
           <w:sz w:val="24"/>
           <w:szCs w:val="24"/>
-        </w:rPr>
-      </w:pPr>
-      <w:r>
-        <w:rPr>
-          <w:bCs/>
-          <w:sz w:val="24"/>
-          <w:szCs w:val="24"/>
-          <w:lang w:val="bg-BG"/>
-        </w:rPr>
-        <w:t>Входни сигнали: пускане/спиране на мотора и изчистване на грешки</w:t>
-      </w:r>
-    </w:p>
-    <w:p>
-      <w:pPr>
-        <w:numPr>
-          <w:ilvl w:val="0"/>
-          <w:numId w:val="2"/>
-        </w:numPr>
-        <w:rPr>
-          <w:b/>
-          <w:sz w:val="24"/>
-          <w:szCs w:val="24"/>
-        </w:rPr>
-      </w:pPr>
-      <w:r>
-        <w:rPr>
-          <w:bCs/>
-          <w:sz w:val="24"/>
-          <w:szCs w:val="24"/>
-          <w:lang w:val="bg-BG"/>
-        </w:rPr>
-        <w:t>Изходни сигнали: грешка с модула</w:t>
-      </w:r>
-    </w:p>
-    <w:p>
-      <w:pPr>
-        <w:rPr>
-          <w:b/>
-          <w:sz w:val="24"/>
-          <w:szCs w:val="24"/>
+          <w:lang w:val="bg-BG"/>
+        </w:rPr>
+      </w:pPr>
+      <w:r>
+        <w:rPr>
+          <w:bCs/>
+          <w:sz w:val="24"/>
+          <w:szCs w:val="24"/>
+          <w:lang w:val="bg-BG"/>
+        </w:rPr>
+        <w:t>Да</w:t>
+      </w:r>
+      <w:r>
+        <w:rPr>
+          <w:bCs/>
+          <w:sz w:val="24"/>
+          <w:szCs w:val="24"/>
+          <w:lang w:val="bg-BG"/>
+        </w:rPr>
+        <w:t xml:space="preserve"> се гарантира взаимозаменяемост на двете решения в рамките на цялостната система за управление на вакуумната инсталация</w:t>
+      </w:r>
+    </w:p>
+    <w:p>
+      <w:pPr>
+        <w:ind w:left="708"/>
+        <w:rPr>
+          <w:b/>
+          <w:sz w:val="24"/>
+          <w:szCs w:val="24"/>
+          <w:lang w:val="bg-BG"/>
         </w:rPr>
       </w:pPr>
     </w:p>
@@ -1303,16 +1233,7 @@
           <w:szCs w:val="24"/>
           <w:lang w:val="bg-BG"/>
         </w:rPr>
-        <w:t>4</w:t>
-      </w:r>
-      <w:r>
-        <w:rPr>
-          <w:b/>
-          <w:sz w:val="24"/>
-          <w:szCs w:val="24"/>
-          <w:lang w:val="bg-BG"/>
-        </w:rPr>
-        <w:t xml:space="preserve">. Обяснителна записка: </w:t>
+        <w:t xml:space="preserve">4. Обяснителна записка: </w:t>
       </w:r>
     </w:p>
     <w:p>
@@ -1336,27 +1257,16 @@
           <w:szCs w:val="24"/>
           <w:lang w:val="bg-BG"/>
         </w:rPr>
-        <w:t xml:space="preserve">Проучване и избор на подходящ драйвер за управление на </w:t>
-      </w:r>
-      <w:proofErr w:type="spellStart"/>
-      <w:r>
-        <w:rPr>
-          <w:bCs/>
-          <w:sz w:val="24"/>
-          <w:szCs w:val="24"/>
-          <w:lang w:val="bg-BG"/>
-        </w:rPr>
-        <w:t>безчетков</w:t>
-      </w:r>
-      <w:proofErr w:type="spellEnd"/>
-      <w:r>
-        <w:rPr>
-          <w:bCs/>
-          <w:sz w:val="24"/>
-          <w:szCs w:val="24"/>
-          <w:lang w:val="bg-BG"/>
-        </w:rPr>
-        <w:t xml:space="preserve"> мотор</w:t>
+        <w:t xml:space="preserve">Проучване и избор на подходящ </w:t>
+      </w:r>
+      <w:r>
+        <w:rPr>
+          <w:bCs/>
+          <w:sz w:val="24"/>
+          <w:szCs w:val="24"/>
+          <w:lang w:val="bg-BG"/>
+        </w:rPr>
+        <w:t>контролер</w:t>
       </w:r>
     </w:p>
     <w:p>
@@ -1380,7 +1290,25 @@
           <w:szCs w:val="24"/>
           <w:lang w:val="bg-BG"/>
         </w:rPr>
-        <w:t>Проучване на съществуващи решения</w:t>
+        <w:t xml:space="preserve">Проучване на </w:t>
+      </w:r>
+      <w:r>
+        <w:rPr>
+          <w:bCs/>
+          <w:sz w:val="24"/>
+          <w:szCs w:val="24"/>
+          <w:lang w:val="bg-BG"/>
+        </w:rPr>
+        <w:t xml:space="preserve">подобни </w:t>
+      </w:r>
+      <w:r>
+        <w:rPr>
+          <w:bCs/>
+          <w:sz w:val="24"/>
+          <w:szCs w:val="24"/>
+          <w:lang w:val="bg-BG"/>
+        </w:rPr>
+        <w:t>съществуващи решения</w:t>
       </w:r>
     </w:p>
     <w:p>
@@ -1437,7 +1365,34 @@
           <w:szCs w:val="24"/>
           <w:lang w:val="bg-BG"/>
         </w:rPr>
-        <w:t>принципна електрическа схема и печатна платка на устройството</w:t>
+        <w:t xml:space="preserve">принципна електрическа схема </w:t>
+      </w:r>
+      <w:r>
+        <w:rPr>
+          <w:bCs/>
+          <w:sz w:val="24"/>
+          <w:szCs w:val="24"/>
+          <w:lang w:val="bg-BG"/>
+        </w:rPr>
+        <w:t xml:space="preserve">и </w:t>
+      </w:r>
+      <w:r>
+        <w:rPr>
+          <w:bCs/>
+          <w:sz w:val="24"/>
+          <w:szCs w:val="24"/>
+          <w:lang w:val="bg-BG"/>
+        </w:rPr>
+        <w:t xml:space="preserve">печатна платка </w:t>
+      </w:r>
+      <w:r>
+        <w:rPr>
+          <w:bCs/>
+          <w:sz w:val="24"/>
+          <w:szCs w:val="24"/>
+          <w:lang w:val="bg-BG"/>
+        </w:rPr>
+        <w:t>на устройството</w:t>
       </w:r>
     </w:p>
     <w:p>
@@ -1461,16 +1416,7 @@
           <w:szCs w:val="24"/>
           <w:lang w:val="bg-BG"/>
         </w:rPr>
-        <w:t>Конфигуриране</w:t>
-      </w:r>
-      <w:r>
-        <w:rPr>
-          <w:bCs/>
-          <w:sz w:val="24"/>
-          <w:szCs w:val="24"/>
-          <w:lang w:val="bg-BG"/>
-        </w:rPr>
-        <w:t xml:space="preserve"> на драйвера</w:t>
+        <w:t>Настройка на управлението</w:t>
       </w:r>
     </w:p>
     <w:p>
@@ -1867,14 +1813,32 @@
     <w:p>
       <w:pPr>
         <w:spacing w:before="120"/>
-        <w:ind w:firstLine="708"/>
-        <w:rPr>
-          <w:rFonts w:ascii="Times New Roman CYR" w:hAnsi="Times New Roman CYR"/>
-          <w:sz w:val="24"/>
-          <w:szCs w:val="24"/>
-          <w:lang w:val="bg-BG"/>
-        </w:rPr>
-      </w:pPr>
+        <w:ind w:firstLine="142"/>
+        <w:rPr>
+          <w:rFonts w:ascii="Times New Roman CYR" w:hAnsi="Times New Roman CYR"/>
+          <w:sz w:val="24"/>
+          <w:szCs w:val="24"/>
+          <w:lang w:val="bg-BG"/>
+        </w:rPr>
+      </w:pPr>
+      <w:r>
+        <w:rPr>
+          <w:rFonts w:ascii="Times New Roman CYR" w:hAnsi="Times New Roman CYR"/>
+          <w:sz w:val="24"/>
+          <w:szCs w:val="24"/>
+          <w:lang w:val="bg-BG"/>
+        </w:rPr>
+        <w:t xml:space="preserve">     </w:t>
+      </w:r>
+      <w:r>
+        <w:rPr>
+          <w:rFonts w:ascii="Times New Roman CYR" w:hAnsi="Times New Roman CYR"/>
+          <w:sz w:val="24"/>
+          <w:szCs w:val="24"/>
+          <w:lang w:val="bg-BG"/>
+        </w:rPr>
+        <w:t xml:space="preserve">    </w:t>
+      </w:r>
       <w:r>
         <w:rPr>
           <w:rFonts w:ascii="Times New Roman CYR" w:hAnsi="Times New Roman CYR"/>
@@ -1891,7 +1855,25 @@
           <w:szCs w:val="24"/>
           <w:lang w:val="bg-BG"/>
         </w:rPr>
-        <w:t xml:space="preserve"> Илиян Антов</w:t>
+        <w:t xml:space="preserve"> </w:t>
+      </w:r>
+      <w:r>
+        <w:rPr>
+          <w:rFonts w:ascii="Times New Roman CYR" w:hAnsi="Times New Roman CYR"/>
+          <w:sz w:val="24"/>
+          <w:szCs w:val="24"/>
+          <w:lang w:val="bg-BG"/>
+        </w:rPr>
+        <w:t xml:space="preserve">инж. </w:t>
+      </w:r>
+      <w:r>
+        <w:rPr>
+          <w:rFonts w:ascii="Times New Roman CYR" w:hAnsi="Times New Roman CYR"/>
+          <w:sz w:val="24"/>
+          <w:szCs w:val="24"/>
+          <w:lang w:val="bg-BG"/>
+        </w:rPr>
+        <w:t>Илиян Антов</w:t>
       </w:r>
       <w:r>
         <w:rPr>
@@ -1909,7 +1891,7 @@
           <w:szCs w:val="24"/>
           <w:lang w:val="ru-RU"/>
         </w:rPr>
-        <w:t xml:space="preserve">/                        </w:t>
+        <w:t xml:space="preserve">/          </w:t>
       </w:r>
       <w:r>
         <w:rPr>
@@ -1918,6 +1900,33 @@
           <w:szCs w:val="24"/>
           <w:lang w:val="ru-RU"/>
         </w:rPr>
+        <w:t xml:space="preserve">       </w:t>
+      </w:r>
+      <w:r>
+        <w:rPr>
+          <w:rFonts w:ascii="Times New Roman CYR" w:hAnsi="Times New Roman CYR"/>
+          <w:sz w:val="24"/>
+          <w:szCs w:val="24"/>
+          <w:lang w:val="ru-RU"/>
+        </w:rPr>
+        <w:t xml:space="preserve">   </w:t>
+      </w:r>
+      <w:r>
+        <w:rPr>
+          <w:rFonts w:ascii="Times New Roman CYR" w:hAnsi="Times New Roman CYR"/>
+          <w:sz w:val="24"/>
+          <w:szCs w:val="24"/>
+          <w:lang w:val="ru-RU"/>
+        </w:rPr>
+        <w:t>/</w:t>
+      </w:r>
+      <w:r>
+        <w:rPr>
+          <w:rFonts w:ascii="Times New Roman CYR" w:hAnsi="Times New Roman CYR"/>
+          <w:sz w:val="24"/>
+          <w:szCs w:val="24"/>
+          <w:lang w:val="ru-RU"/>
+        </w:rPr>
         <w:t xml:space="preserve"> </w:t>
       </w:r>
       <w:r>
@@ -1927,79 +1936,68 @@
           <w:szCs w:val="24"/>
           <w:lang w:val="ru-RU"/>
         </w:rPr>
+        <w:t xml:space="preserve">инж. </w:t>
+      </w:r>
+      <w:r>
+        <w:rPr>
+          <w:rFonts w:ascii="Times New Roman CYR" w:hAnsi="Times New Roman CYR"/>
+          <w:sz w:val="24"/>
+          <w:szCs w:val="24"/>
+          <w:lang w:val="ru-RU"/>
+        </w:rPr>
+        <w:t xml:space="preserve">Борис Ботев </w:t>
+      </w:r>
+      <w:r>
+        <w:rPr>
+          <w:sz w:val="24"/>
+          <w:szCs w:val="24"/>
+          <w:lang w:val="bg-BG"/>
+        </w:rPr>
+        <w:t>/</w:t>
+      </w:r>
+      <w:r>
+        <w:rPr>
+          <w:sz w:val="24"/>
+          <w:szCs w:val="24"/>
+          <w:lang w:val="bg-BG"/>
+        </w:rPr>
+        <w:t xml:space="preserve">          </w:t>
+      </w:r>
+      <w:r>
+        <w:rPr>
+          <w:sz w:val="24"/>
+          <w:szCs w:val="24"/>
+          <w:lang w:val="bg-BG"/>
+        </w:rPr>
+        <w:t xml:space="preserve">  </w:t>
+      </w:r>
+      <w:r>
+        <w:rPr>
+          <w:sz w:val="24"/>
+          <w:szCs w:val="24"/>
+          <w:lang w:val="bg-BG"/>
+        </w:rPr>
+        <w:t xml:space="preserve">   </w:t>
+      </w:r>
+      <w:r>
+        <w:rPr>
+          <w:sz w:val="24"/>
+          <w:szCs w:val="24"/>
+          <w:lang w:val="bg-BG"/>
+        </w:rPr>
+        <w:t>/</w:t>
+      </w:r>
+      <w:r>
         <w:t xml:space="preserve"> </w:t>
       </w:r>
       <w:r>
         <w:rPr>
-          <w:rFonts w:ascii="Times New Roman CYR" w:hAnsi="Times New Roman CYR"/>
-          <w:sz w:val="24"/>
-          <w:szCs w:val="24"/>
-          <w:lang w:val="ru-RU"/>
-        </w:rPr>
-        <w:t>/</w:t>
-      </w:r>
-      <w:r>
-        <w:rPr>
-          <w:rFonts w:ascii="Times New Roman CYR" w:hAnsi="Times New Roman CYR"/>
-          <w:sz w:val="24"/>
-          <w:szCs w:val="24"/>
-          <w:lang w:val="ru-RU"/>
-        </w:rPr>
-        <w:t xml:space="preserve"> Борис Ботев </w:t>
-      </w:r>
-      <w:r>
-        <w:rPr>
-          <w:sz w:val="24"/>
-          <w:szCs w:val="24"/>
-          <w:lang w:val="bg-BG"/>
-        </w:rPr>
-        <w:t>/</w:t>
-      </w:r>
-      <w:r>
-        <w:rPr>
-          <w:sz w:val="24"/>
-          <w:szCs w:val="24"/>
-          <w:lang w:val="bg-BG"/>
-        </w:rPr>
-        <w:t xml:space="preserve">                     </w:t>
-      </w:r>
-      <w:r>
-        <w:rPr>
-          <w:sz w:val="24"/>
-          <w:szCs w:val="24"/>
-          <w:lang w:val="bg-BG"/>
-        </w:rPr>
-        <w:t xml:space="preserve">  </w:t>
-      </w:r>
-      <w:r>
-        <w:rPr>
-          <w:sz w:val="24"/>
-          <w:szCs w:val="24"/>
-          <w:lang w:val="bg-BG"/>
-        </w:rPr>
-        <w:t>/</w:t>
-      </w:r>
-      <w:r>
-        <w:t xml:space="preserve"> </w:t>
-      </w:r>
-      <w:r>
-        <w:rPr>
-          <w:sz w:val="24"/>
-          <w:szCs w:val="24"/>
-          <w:lang w:val="bg-BG"/>
-        </w:rPr>
-        <w:t xml:space="preserve">ас. инж. Николай </w:t>
-      </w:r>
-      <w:proofErr w:type="spellStart"/>
-      <w:r>
-        <w:rPr>
-          <w:sz w:val="24"/>
-          <w:szCs w:val="24"/>
-          <w:lang w:val="bg-BG"/>
-        </w:rPr>
-        <w:t>Тюлиев</w:t>
-      </w:r>
-      <w:proofErr w:type="spellEnd"/>
+          <w:sz w:val="24"/>
+          <w:szCs w:val="24"/>
+          <w:lang w:val="bg-BG"/>
+        </w:rPr>
+        <w:t>ас. инж. Николай Тюлиев</w:t>
+      </w:r>
       <w:r>
         <w:rPr>
           <w:sz w:val="24"/>
@@ -3040,7 +3038,6 @@
   <w:style w:type="character" w:default="1" w:styleId="DefaultParagraphFont">
     <w:name w:val="Default Paragraph Font"/>
     <w:uiPriority w:val="1"/>
-    <w:semiHidden/>
     <w:unhideWhenUsed/>
   </w:style>
   <w:style w:type="table" w:default="1" w:styleId="TableNormal">

</xml_diff>

<commit_message>
Small redactions after review
</commit_message>
<xml_diff>
--- a/Documentation/Z_Iliyan_Antov_101324019.docx
+++ b/Documentation/Z_Iliyan_Antov_101324019.docx
@@ -1,6 +1,6 @@
 
 <file path=word/document.xml><?xml version="1.0" encoding="utf-8"?>
-<w:document xmlns:wpc="http://schemas.microsoft.com/office/word/2010/wordprocessingCanvas" xmlns:cx="http://schemas.microsoft.com/office/drawing/2014/chartex" xmlns:cx1="http://schemas.microsoft.com/office/drawing/2015/9/8/chartex" xmlns:cx2="http://schemas.microsoft.com/office/drawing/2015/10/21/chartex" xmlns:cx3="http://schemas.microsoft.com/office/drawing/2016/5/9/chartex" xmlns:cx4="http://schemas.microsoft.com/office/drawing/2016/5/10/chartex" xmlns:cx5="http://schemas.microsoft.com/office/drawing/2016/5/11/chartex" xmlns:cx6="http://schemas.microsoft.com/office/drawing/2016/5/12/chartex" xmlns:cx7="http://schemas.microsoft.com/office/drawing/2016/5/13/chartex" xmlns:cx8="http://schemas.microsoft.com/office/drawing/2016/5/14/chartex" xmlns:mc="http://schemas.openxmlformats.org/markup-compatibility/2006" xmlns:aink="http://schemas.microsoft.com/office/drawing/2016/ink" xmlns:am3d="http://schemas.microsoft.com/office/drawing/2017/model3d" xmlns:o="urn:schemas-microsoft-com:office:office" xmlns:oel="http://schemas.microsoft.com/office/2019/extlst" xmlns:r="http://schemas.openxmlformats.org/officeDocument/2006/relationships" xmlns:m="http://schemas.openxmlformats.org/officeDocument/2006/math" xmlns:v="urn:schemas-microsoft-com:vml" xmlns:wp14="http://schemas.microsoft.com/office/word/2010/wordprocessingDrawing" xmlns:wp="http://schemas.openxmlformats.org/drawingml/2006/wordprocessingDrawing" xmlns:w10="urn:schemas-microsoft-com:office:word" xmlns:w="http://schemas.openxmlformats.org/wordprocessingml/2006/main" xmlns:w14="http://schemas.microsoft.com/office/word/2010/wordml" xmlns:w15="http://schemas.microsoft.com/office/word/2012/wordml" xmlns:w16cex="http://schemas.microsoft.com/office/word/2018/wordml/cex" xmlns:w16cid="http://schemas.microsoft.com/office/word/2016/wordml/cid" xmlns:w16="http://schemas.microsoft.com/office/word/2018/wordml" xmlns:w16du="http://schemas.microsoft.com/office/word/2023/wordml/word16du" xmlns:w16sdtdh="http://schemas.microsoft.com/office/word/2020/wordml/sdtdatahash" xmlns:w16sdtfl="http://schemas.microsoft.com/office/word/2024/wordml/sdtformatlock" xmlns:w16se="http://schemas.microsoft.com/office/word/2015/wordml/symex" xmlns:wpg="http://schemas.microsoft.com/office/word/2010/wordprocessingGroup" xmlns:wpi="http://schemas.microsoft.com/office/word/2010/wordprocessingInk" xmlns:wne="http://schemas.microsoft.com/office/word/2006/wordml" xmlns:wps="http://schemas.microsoft.com/office/word/2010/wordprocessingShape" mc:Ignorable="w14 w15 w16se w16cid w16 w16cex w16sdtdh w16sdtfl w16du wp14">
+<w:document xmlns:wpc="http://schemas.microsoft.com/office/word/2010/wordprocessingCanvas" xmlns:mc="http://schemas.openxmlformats.org/markup-compatibility/2006" xmlns:o="urn:schemas-microsoft-com:office:office" xmlns:r="http://schemas.openxmlformats.org/officeDocument/2006/relationships" xmlns:m="http://schemas.openxmlformats.org/officeDocument/2006/math" xmlns:v="urn:schemas-microsoft-com:vml" xmlns:wp14="http://schemas.microsoft.com/office/word/2010/wordprocessingDrawing" xmlns:wp="http://schemas.openxmlformats.org/drawingml/2006/wordprocessingDrawing" xmlns:w10="urn:schemas-microsoft-com:office:word" xmlns:w="http://schemas.openxmlformats.org/wordprocessingml/2006/main" xmlns:w14="http://schemas.microsoft.com/office/word/2010/wordml" xmlns:w15="http://schemas.microsoft.com/office/word/2012/wordml" xmlns:wpg="http://schemas.microsoft.com/office/word/2010/wordprocessingGroup" xmlns:wpi="http://schemas.microsoft.com/office/word/2010/wordprocessingInk" xmlns:wne="http://schemas.microsoft.com/office/word/2006/wordml" xmlns:wps="http://schemas.microsoft.com/office/word/2010/wordprocessingShape" mc:Ignorable="w14 w15 wp14">
   <w:body>
     <w:tbl>
       <w:tblPr>
@@ -35,7 +35,7 @@
             <w:r>
               <w:rPr>
                 <w:noProof/>
-                <w:lang w:eastAsia="en-US"/>
+                <w:lang w:val="bg-BG"/>
               </w:rPr>
               <w:drawing>
                 <wp:inline distT="0" distB="0" distL="0" distR="0" wp14:anchorId="3FE8F572" wp14:editId="3E762132">
@@ -132,6 +132,7 @@
             <w:r>
               <w:rPr>
                 <w:noProof/>
+                <w:lang w:val="bg-BG"/>
               </w:rPr>
               <w:drawing>
                 <wp:inline distT="0" distB="0" distL="0" distR="0" wp14:anchorId="671CE9E2" wp14:editId="67EB06F0">
@@ -457,16 +458,35 @@
           <w:szCs w:val="22"/>
           <w:lang w:val="ru-RU"/>
         </w:rPr>
-        <w:t xml:space="preserve">Дата на задаване: </w:t>
-      </w:r>
-      <w:r>
-        <w:rPr>
-          <w:b/>
-          <w:sz w:val="24"/>
-          <w:szCs w:val="24"/>
+        <w:t xml:space="preserve">Дата на </w:t>
+      </w:r>
+      <w:proofErr w:type="spellStart"/>
+      <w:r>
+        <w:rPr>
+          <w:b/>
+          <w:sz w:val="22"/>
+          <w:szCs w:val="22"/>
           <w:lang w:val="ru-RU"/>
         </w:rPr>
-        <w:t>25</w:t>
+        <w:t>задаване</w:t>
+      </w:r>
+      <w:proofErr w:type="spellEnd"/>
+      <w:r>
+        <w:rPr>
+          <w:b/>
+          <w:sz w:val="22"/>
+          <w:szCs w:val="22"/>
+          <w:lang w:val="ru-RU"/>
+        </w:rPr>
+        <w:t xml:space="preserve">: </w:t>
+      </w:r>
+      <w:r>
+        <w:rPr>
+          <w:b/>
+          <w:sz w:val="22"/>
+          <w:szCs w:val="22"/>
+        </w:rPr>
+        <w:t>19</w:t>
       </w:r>
       <w:r>
         <w:rPr>
@@ -512,7 +532,32 @@
           <w:szCs w:val="22"/>
           <w:lang w:val="ru-RU"/>
         </w:rPr>
-        <w:t xml:space="preserve">Дата на предаване: </w:t>
+        <w:t xml:space="preserve">Дата на </w:t>
+      </w:r>
+      <w:proofErr w:type="spellStart"/>
+      <w:r>
+        <w:rPr>
+          <w:sz w:val="22"/>
+          <w:szCs w:val="22"/>
+          <w:lang w:val="ru-RU"/>
+        </w:rPr>
+        <w:t>предаване</w:t>
+      </w:r>
+      <w:proofErr w:type="spellEnd"/>
+      <w:r>
+        <w:rPr>
+          <w:sz w:val="22"/>
+          <w:szCs w:val="22"/>
+          <w:lang w:val="ru-RU"/>
+        </w:rPr>
+        <w:t xml:space="preserve">: </w:t>
+      </w:r>
+      <w:r>
+        <w:rPr>
+          <w:sz w:val="22"/>
+          <w:szCs w:val="22"/>
+        </w:rPr>
+        <w:t>1</w:t>
       </w:r>
       <w:r>
         <w:rPr>
@@ -526,25 +571,16 @@
         <w:rPr>
           <w:sz w:val="24"/>
           <w:szCs w:val="24"/>
-          <w:lang w:val="bg-BG"/>
+          <w:lang w:val="ru-RU"/>
+        </w:rPr>
+        <w:t>.0</w:t>
+      </w:r>
+      <w:r>
+        <w:rPr>
+          <w:sz w:val="24"/>
+          <w:szCs w:val="24"/>
         </w:rPr>
         <w:t>7</w:t>
-      </w:r>
-      <w:r>
-        <w:rPr>
-          <w:sz w:val="24"/>
-          <w:szCs w:val="24"/>
-          <w:lang w:val="ru-RU"/>
-        </w:rPr>
-        <w:t>.0</w:t>
-      </w:r>
-      <w:r>
-        <w:rPr>
-          <w:sz w:val="24"/>
-          <w:szCs w:val="24"/>
-          <w:lang w:val="bg-BG"/>
-        </w:rPr>
-        <w:t>6</w:t>
       </w:r>
       <w:r>
         <w:rPr>
@@ -671,6 +707,7 @@
       <w:r>
         <w:rPr>
           <w:rFonts w:ascii="Times New Roman CYR" w:hAnsi="Times New Roman CYR"/>
+          <w:b/>
           <w:sz w:val="24"/>
           <w:szCs w:val="24"/>
           <w:lang w:val="bg-BG"/>
@@ -708,6 +745,7 @@
       </w:r>
       <w:r>
         <w:rPr>
+          <w:b/>
           <w:bCs/>
           <w:sz w:val="24"/>
           <w:szCs w:val="24"/>
@@ -717,6 +755,7 @@
       </w:r>
       <w:r>
         <w:rPr>
+          <w:b/>
           <w:bCs/>
           <w:sz w:val="24"/>
           <w:szCs w:val="24"/>
@@ -763,6 +802,7 @@
       <w:r>
         <w:rPr>
           <w:rFonts w:ascii="Times New Roman CYR" w:hAnsi="Times New Roman CYR"/>
+          <w:b/>
           <w:bCs/>
           <w:sz w:val="24"/>
           <w:szCs w:val="24"/>
@@ -772,6 +812,7 @@
       <w:r>
         <w:rPr>
           <w:rFonts w:ascii="Times New Roman CYR" w:hAnsi="Times New Roman CYR"/>
+          <w:b/>
           <w:bCs/>
           <w:sz w:val="24"/>
           <w:szCs w:val="24"/>
@@ -809,6 +850,7 @@
       </w:r>
       <w:r>
         <w:rPr>
+          <w:b/>
           <w:bCs/>
           <w:sz w:val="24"/>
           <w:szCs w:val="24"/>
@@ -847,6 +889,7 @@
       </w:r>
       <w:r>
         <w:rPr>
+          <w:b/>
           <w:sz w:val="24"/>
           <w:szCs w:val="24"/>
           <w:lang w:val="bg-BG"/>
@@ -1035,16 +1078,7 @@
           <w:szCs w:val="24"/>
           <w:lang w:val="bg-BG"/>
         </w:rPr>
-        <w:t xml:space="preserve">, </w:t>
-      </w:r>
-      <w:r>
-        <w:rPr>
-          <w:bCs/>
-          <w:sz w:val="24"/>
-          <w:szCs w:val="24"/>
-          <w:lang w:val="bg-BG"/>
-        </w:rPr>
-        <w:t>ко</w:t>
+        <w:t>, ко</w:t>
       </w:r>
       <w:r>
         <w:rPr>
@@ -1085,16 +1119,7 @@
           <w:szCs w:val="24"/>
           <w:lang w:val="bg-BG"/>
         </w:rPr>
-        <w:t xml:space="preserve">Да се анализират </w:t>
-      </w:r>
-      <w:r>
-        <w:rPr>
-          <w:bCs/>
-          <w:sz w:val="24"/>
-          <w:szCs w:val="24"/>
-          <w:lang w:val="bg-BG"/>
-        </w:rPr>
-        <w:t>недостатъци</w:t>
+        <w:t>Да се анализират недостатъци</w:t>
       </w:r>
       <w:r>
         <w:rPr>
@@ -1235,6 +1260,8 @@
         </w:rPr>
         <w:t xml:space="preserve">4. Обяснителна записка: </w:t>
       </w:r>
+      <w:bookmarkStart w:id="0" w:name="_GoBack"/>
+      <w:bookmarkEnd w:id="0"/>
     </w:p>
     <w:p>
       <w:pPr>
@@ -1257,16 +1284,34 @@
           <w:szCs w:val="24"/>
           <w:lang w:val="bg-BG"/>
         </w:rPr>
-        <w:t xml:space="preserve">Проучване и избор на подходящ </w:t>
-      </w:r>
-      <w:r>
-        <w:rPr>
-          <w:bCs/>
-          <w:sz w:val="24"/>
-          <w:szCs w:val="24"/>
-          <w:lang w:val="bg-BG"/>
-        </w:rPr>
-        <w:t>контролер</w:t>
+        <w:t xml:space="preserve">Проучване на </w:t>
+      </w:r>
+      <w:r>
+        <w:rPr>
+          <w:bCs/>
+          <w:sz w:val="24"/>
+          <w:szCs w:val="24"/>
+          <w:lang w:val="bg-BG"/>
+        </w:rPr>
+        <w:t xml:space="preserve">съществуващи </w:t>
+      </w:r>
+      <w:r>
+        <w:rPr>
+          <w:bCs/>
+          <w:sz w:val="24"/>
+          <w:szCs w:val="24"/>
+          <w:lang w:val="bg-BG"/>
+        </w:rPr>
+        <w:t xml:space="preserve">подобни </w:t>
+      </w:r>
+      <w:r>
+        <w:rPr>
+          <w:bCs/>
+          <w:sz w:val="24"/>
+          <w:szCs w:val="24"/>
+          <w:lang w:val="bg-BG"/>
+        </w:rPr>
+        <w:t>решения</w:t>
       </w:r>
     </w:p>
     <w:p>
@@ -1290,25 +1335,7 @@
           <w:szCs w:val="24"/>
           <w:lang w:val="bg-BG"/>
         </w:rPr>
-        <w:t xml:space="preserve">Проучване на </w:t>
-      </w:r>
-      <w:r>
-        <w:rPr>
-          <w:bCs/>
-          <w:sz w:val="24"/>
-          <w:szCs w:val="24"/>
-          <w:lang w:val="bg-BG"/>
-        </w:rPr>
-        <w:t xml:space="preserve">подобни </w:t>
-      </w:r>
-      <w:r>
-        <w:rPr>
-          <w:bCs/>
-          <w:sz w:val="24"/>
-          <w:szCs w:val="24"/>
-          <w:lang w:val="bg-BG"/>
-        </w:rPr>
-        <w:t>съществуващи решения</w:t>
+        <w:t>Проучване и избор на подходящ контролер</w:t>
       </w:r>
     </w:p>
     <w:p>
@@ -1374,16 +1401,7 @@
           <w:szCs w:val="24"/>
           <w:lang w:val="bg-BG"/>
         </w:rPr>
-        <w:t xml:space="preserve">и </w:t>
-      </w:r>
-      <w:r>
-        <w:rPr>
-          <w:bCs/>
-          <w:sz w:val="24"/>
-          <w:szCs w:val="24"/>
-          <w:lang w:val="bg-BG"/>
-        </w:rPr>
-        <w:t xml:space="preserve">печатна платка </w:t>
+        <w:t xml:space="preserve">и печатна платка </w:t>
       </w:r>
       <w:r>
         <w:rPr>
@@ -2202,7 +2220,7 @@
 </file>
 
 <file path=word/endnotes.xml><?xml version="1.0" encoding="utf-8"?>
-<w:endnotes xmlns:wpc="http://schemas.microsoft.com/office/word/2010/wordprocessingCanvas" xmlns:cx="http://schemas.microsoft.com/office/drawing/2014/chartex" xmlns:cx1="http://schemas.microsoft.com/office/drawing/2015/9/8/chartex" xmlns:cx2="http://schemas.microsoft.com/office/drawing/2015/10/21/chartex" xmlns:cx3="http://schemas.microsoft.com/office/drawing/2016/5/9/chartex" xmlns:cx4="http://schemas.microsoft.com/office/drawing/2016/5/10/chartex" xmlns:cx5="http://schemas.microsoft.com/office/drawing/2016/5/11/chartex" xmlns:cx6="http://schemas.microsoft.com/office/drawing/2016/5/12/chartex" xmlns:cx7="http://schemas.microsoft.com/office/drawing/2016/5/13/chartex" xmlns:cx8="http://schemas.microsoft.com/office/drawing/2016/5/14/chartex" xmlns:mc="http://schemas.openxmlformats.org/markup-compatibility/2006" xmlns:aink="http://schemas.microsoft.com/office/drawing/2016/ink" xmlns:am3d="http://schemas.microsoft.com/office/drawing/2017/model3d" xmlns:o="urn:schemas-microsoft-com:office:office" xmlns:oel="http://schemas.microsoft.com/office/2019/extlst" xmlns:r="http://schemas.openxmlformats.org/officeDocument/2006/relationships" xmlns:m="http://schemas.openxmlformats.org/officeDocument/2006/math" xmlns:v="urn:schemas-microsoft-com:vml" xmlns:wp14="http://schemas.microsoft.com/office/word/2010/wordprocessingDrawing" xmlns:wp="http://schemas.openxmlformats.org/drawingml/2006/wordprocessingDrawing" xmlns:w10="urn:schemas-microsoft-com:office:word" xmlns:w="http://schemas.openxmlformats.org/wordprocessingml/2006/main" xmlns:w14="http://schemas.microsoft.com/office/word/2010/wordml" xmlns:w15="http://schemas.microsoft.com/office/word/2012/wordml" xmlns:w16cex="http://schemas.microsoft.com/office/word/2018/wordml/cex" xmlns:w16cid="http://schemas.microsoft.com/office/word/2016/wordml/cid" xmlns:w16="http://schemas.microsoft.com/office/word/2018/wordml" xmlns:w16du="http://schemas.microsoft.com/office/word/2023/wordml/word16du" xmlns:w16sdtdh="http://schemas.microsoft.com/office/word/2020/wordml/sdtdatahash" xmlns:w16sdtfl="http://schemas.microsoft.com/office/word/2024/wordml/sdtformatlock" xmlns:w16se="http://schemas.microsoft.com/office/word/2015/wordml/symex" xmlns:wpg="http://schemas.microsoft.com/office/word/2010/wordprocessingGroup" xmlns:wpi="http://schemas.microsoft.com/office/word/2010/wordprocessingInk" xmlns:wne="http://schemas.microsoft.com/office/word/2006/wordml" xmlns:wps="http://schemas.microsoft.com/office/word/2010/wordprocessingShape" mc:Ignorable="w14 w15 w16se w16cid w16 w16cex w16sdtdh w16sdtfl w16du wp14">
+<w:endnotes xmlns:wpc="http://schemas.microsoft.com/office/word/2010/wordprocessingCanvas" xmlns:mc="http://schemas.openxmlformats.org/markup-compatibility/2006" xmlns:o="urn:schemas-microsoft-com:office:office" xmlns:r="http://schemas.openxmlformats.org/officeDocument/2006/relationships" xmlns:m="http://schemas.openxmlformats.org/officeDocument/2006/math" xmlns:v="urn:schemas-microsoft-com:vml" xmlns:wp14="http://schemas.microsoft.com/office/word/2010/wordprocessingDrawing" xmlns:wp="http://schemas.openxmlformats.org/drawingml/2006/wordprocessingDrawing" xmlns:w10="urn:schemas-microsoft-com:office:word" xmlns:w="http://schemas.openxmlformats.org/wordprocessingml/2006/main" xmlns:w14="http://schemas.microsoft.com/office/word/2010/wordml" xmlns:w15="http://schemas.microsoft.com/office/word/2012/wordml" xmlns:wpg="http://schemas.microsoft.com/office/word/2010/wordprocessingGroup" xmlns:wpi="http://schemas.microsoft.com/office/word/2010/wordprocessingInk" xmlns:wne="http://schemas.microsoft.com/office/word/2006/wordml" xmlns:wps="http://schemas.microsoft.com/office/word/2010/wordprocessingShape" mc:Ignorable="w14 w15 wp14">
   <w:endnote w:type="separator" w:id="-1">
     <w:p>
       <w:r>
@@ -2221,7 +2239,7 @@
 </file>
 
 <file path=word/footer1.xml><?xml version="1.0" encoding="utf-8"?>
-<w:ftr xmlns:wpc="http://schemas.microsoft.com/office/word/2010/wordprocessingCanvas" xmlns:cx="http://schemas.microsoft.com/office/drawing/2014/chartex" xmlns:cx1="http://schemas.microsoft.com/office/drawing/2015/9/8/chartex" xmlns:cx2="http://schemas.microsoft.com/office/drawing/2015/10/21/chartex" xmlns:cx3="http://schemas.microsoft.com/office/drawing/2016/5/9/chartex" xmlns:cx4="http://schemas.microsoft.com/office/drawing/2016/5/10/chartex" xmlns:cx5="http://schemas.microsoft.com/office/drawing/2016/5/11/chartex" xmlns:cx6="http://schemas.microsoft.com/office/drawing/2016/5/12/chartex" xmlns:cx7="http://schemas.microsoft.com/office/drawing/2016/5/13/chartex" xmlns:cx8="http://schemas.microsoft.com/office/drawing/2016/5/14/chartex" xmlns:mc="http://schemas.openxmlformats.org/markup-compatibility/2006" xmlns:aink="http://schemas.microsoft.com/office/drawing/2016/ink" xmlns:am3d="http://schemas.microsoft.com/office/drawing/2017/model3d" xmlns:o="urn:schemas-microsoft-com:office:office" xmlns:oel="http://schemas.microsoft.com/office/2019/extlst" xmlns:r="http://schemas.openxmlformats.org/officeDocument/2006/relationships" xmlns:m="http://schemas.openxmlformats.org/officeDocument/2006/math" xmlns:v="urn:schemas-microsoft-com:vml" xmlns:wp14="http://schemas.microsoft.com/office/word/2010/wordprocessingDrawing" xmlns:wp="http://schemas.openxmlformats.org/drawingml/2006/wordprocessingDrawing" xmlns:w10="urn:schemas-microsoft-com:office:word" xmlns:w="http://schemas.openxmlformats.org/wordprocessingml/2006/main" xmlns:w14="http://schemas.microsoft.com/office/word/2010/wordml" xmlns:w15="http://schemas.microsoft.com/office/word/2012/wordml" xmlns:w16cex="http://schemas.microsoft.com/office/word/2018/wordml/cex" xmlns:w16cid="http://schemas.microsoft.com/office/word/2016/wordml/cid" xmlns:w16="http://schemas.microsoft.com/office/word/2018/wordml" xmlns:w16du="http://schemas.microsoft.com/office/word/2023/wordml/word16du" xmlns:w16sdtdh="http://schemas.microsoft.com/office/word/2020/wordml/sdtdatahash" xmlns:w16sdtfl="http://schemas.microsoft.com/office/word/2024/wordml/sdtformatlock" xmlns:w16se="http://schemas.microsoft.com/office/word/2015/wordml/symex" xmlns:wpg="http://schemas.microsoft.com/office/word/2010/wordprocessingGroup" xmlns:wpi="http://schemas.microsoft.com/office/word/2010/wordprocessingInk" xmlns:wne="http://schemas.microsoft.com/office/word/2006/wordml" xmlns:wps="http://schemas.microsoft.com/office/word/2010/wordprocessingShape" mc:Ignorable="w14 w15 w16se w16cid w16 w16cex w16sdtdh w16sdtfl w16du wp14">
+<w:ftr xmlns:wpc="http://schemas.microsoft.com/office/word/2010/wordprocessingCanvas" xmlns:mc="http://schemas.openxmlformats.org/markup-compatibility/2006" xmlns:o="urn:schemas-microsoft-com:office:office" xmlns:r="http://schemas.openxmlformats.org/officeDocument/2006/relationships" xmlns:m="http://schemas.openxmlformats.org/officeDocument/2006/math" xmlns:v="urn:schemas-microsoft-com:vml" xmlns:wp14="http://schemas.microsoft.com/office/word/2010/wordprocessingDrawing" xmlns:wp="http://schemas.openxmlformats.org/drawingml/2006/wordprocessingDrawing" xmlns:w10="urn:schemas-microsoft-com:office:word" xmlns:w="http://schemas.openxmlformats.org/wordprocessingml/2006/main" xmlns:w14="http://schemas.microsoft.com/office/word/2010/wordml" xmlns:w15="http://schemas.microsoft.com/office/word/2012/wordml" xmlns:wpg="http://schemas.microsoft.com/office/word/2010/wordprocessingGroup" xmlns:wpi="http://schemas.microsoft.com/office/word/2010/wordprocessingInk" xmlns:wne="http://schemas.microsoft.com/office/word/2006/wordml" xmlns:wps="http://schemas.microsoft.com/office/word/2010/wordprocessingShape" mc:Ignorable="w14 w15 wp14">
   <w:p>
     <w:pPr>
       <w:pStyle w:val="Footer"/>
@@ -2299,7 +2317,7 @@
 </file>
 
 <file path=word/footnotes.xml><?xml version="1.0" encoding="utf-8"?>
-<w:footnotes xmlns:wpc="http://schemas.microsoft.com/office/word/2010/wordprocessingCanvas" xmlns:cx="http://schemas.microsoft.com/office/drawing/2014/chartex" xmlns:cx1="http://schemas.microsoft.com/office/drawing/2015/9/8/chartex" xmlns:cx2="http://schemas.microsoft.com/office/drawing/2015/10/21/chartex" xmlns:cx3="http://schemas.microsoft.com/office/drawing/2016/5/9/chartex" xmlns:cx4="http://schemas.microsoft.com/office/drawing/2016/5/10/chartex" xmlns:cx5="http://schemas.microsoft.com/office/drawing/2016/5/11/chartex" xmlns:cx6="http://schemas.microsoft.com/office/drawing/2016/5/12/chartex" xmlns:cx7="http://schemas.microsoft.com/office/drawing/2016/5/13/chartex" xmlns:cx8="http://schemas.microsoft.com/office/drawing/2016/5/14/chartex" xmlns:mc="http://schemas.openxmlformats.org/markup-compatibility/2006" xmlns:aink="http://schemas.microsoft.com/office/drawing/2016/ink" xmlns:am3d="http://schemas.microsoft.com/office/drawing/2017/model3d" xmlns:o="urn:schemas-microsoft-com:office:office" xmlns:oel="http://schemas.microsoft.com/office/2019/extlst" xmlns:r="http://schemas.openxmlformats.org/officeDocument/2006/relationships" xmlns:m="http://schemas.openxmlformats.org/officeDocument/2006/math" xmlns:v="urn:schemas-microsoft-com:vml" xmlns:wp14="http://schemas.microsoft.com/office/word/2010/wordprocessingDrawing" xmlns:wp="http://schemas.openxmlformats.org/drawingml/2006/wordprocessingDrawing" xmlns:w10="urn:schemas-microsoft-com:office:word" xmlns:w="http://schemas.openxmlformats.org/wordprocessingml/2006/main" xmlns:w14="http://schemas.microsoft.com/office/word/2010/wordml" xmlns:w15="http://schemas.microsoft.com/office/word/2012/wordml" xmlns:w16cex="http://schemas.microsoft.com/office/word/2018/wordml/cex" xmlns:w16cid="http://schemas.microsoft.com/office/word/2016/wordml/cid" xmlns:w16="http://schemas.microsoft.com/office/word/2018/wordml" xmlns:w16du="http://schemas.microsoft.com/office/word/2023/wordml/word16du" xmlns:w16sdtdh="http://schemas.microsoft.com/office/word/2020/wordml/sdtdatahash" xmlns:w16sdtfl="http://schemas.microsoft.com/office/word/2024/wordml/sdtformatlock" xmlns:w16se="http://schemas.microsoft.com/office/word/2015/wordml/symex" xmlns:wpg="http://schemas.microsoft.com/office/word/2010/wordprocessingGroup" xmlns:wpi="http://schemas.microsoft.com/office/word/2010/wordprocessingInk" xmlns:wne="http://schemas.microsoft.com/office/word/2006/wordml" xmlns:wps="http://schemas.microsoft.com/office/word/2010/wordprocessingShape" mc:Ignorable="w14 w15 w16se w16cid w16 w16cex w16sdtdh w16sdtfl w16du wp14">
+<w:footnotes xmlns:wpc="http://schemas.microsoft.com/office/word/2010/wordprocessingCanvas" xmlns:mc="http://schemas.openxmlformats.org/markup-compatibility/2006" xmlns:o="urn:schemas-microsoft-com:office:office" xmlns:r="http://schemas.openxmlformats.org/officeDocument/2006/relationships" xmlns:m="http://schemas.openxmlformats.org/officeDocument/2006/math" xmlns:v="urn:schemas-microsoft-com:vml" xmlns:wp14="http://schemas.microsoft.com/office/word/2010/wordprocessingDrawing" xmlns:wp="http://schemas.openxmlformats.org/drawingml/2006/wordprocessingDrawing" xmlns:w10="urn:schemas-microsoft-com:office:word" xmlns:w="http://schemas.openxmlformats.org/wordprocessingml/2006/main" xmlns:w14="http://schemas.microsoft.com/office/word/2010/wordml" xmlns:w15="http://schemas.microsoft.com/office/word/2012/wordml" xmlns:wpg="http://schemas.microsoft.com/office/word/2010/wordprocessingGroup" xmlns:wpi="http://schemas.microsoft.com/office/word/2010/wordprocessingInk" xmlns:wne="http://schemas.microsoft.com/office/word/2006/wordml" xmlns:wps="http://schemas.microsoft.com/office/word/2010/wordprocessingShape" mc:Ignorable="w14 w15 wp14">
   <w:footnote w:type="separator" w:id="-1">
     <w:p>
       <w:r>
@@ -2318,8 +2336,8 @@
 </file>
 
 <file path=word/numbering.xml><?xml version="1.0" encoding="utf-8"?>
-<w:numbering xmlns:wpc="http://schemas.microsoft.com/office/word/2010/wordprocessingCanvas" xmlns:cx="http://schemas.microsoft.com/office/drawing/2014/chartex" xmlns:cx1="http://schemas.microsoft.com/office/drawing/2015/9/8/chartex" xmlns:cx2="http://schemas.microsoft.com/office/drawing/2015/10/21/chartex" xmlns:cx3="http://schemas.microsoft.com/office/drawing/2016/5/9/chartex" xmlns:cx4="http://schemas.microsoft.com/office/drawing/2016/5/10/chartex" xmlns:cx5="http://schemas.microsoft.com/office/drawing/2016/5/11/chartex" xmlns:cx6="http://schemas.microsoft.com/office/drawing/2016/5/12/chartex" xmlns:cx7="http://schemas.microsoft.com/office/drawing/2016/5/13/chartex" xmlns:cx8="http://schemas.microsoft.com/office/drawing/2016/5/14/chartex" xmlns:mc="http://schemas.openxmlformats.org/markup-compatibility/2006" xmlns:aink="http://schemas.microsoft.com/office/drawing/2016/ink" xmlns:am3d="http://schemas.microsoft.com/office/drawing/2017/model3d" xmlns:o="urn:schemas-microsoft-com:office:office" xmlns:oel="http://schemas.microsoft.com/office/2019/extlst" xmlns:r="http://schemas.openxmlformats.org/officeDocument/2006/relationships" xmlns:m="http://schemas.openxmlformats.org/officeDocument/2006/math" xmlns:v="urn:schemas-microsoft-com:vml" xmlns:wp14="http://schemas.microsoft.com/office/word/2010/wordprocessingDrawing" xmlns:wp="http://schemas.openxmlformats.org/drawingml/2006/wordprocessingDrawing" xmlns:w10="urn:schemas-microsoft-com:office:word" xmlns:w="http://schemas.openxmlformats.org/wordprocessingml/2006/main" xmlns:w14="http://schemas.microsoft.com/office/word/2010/wordml" xmlns:w15="http://schemas.microsoft.com/office/word/2012/wordml" xmlns:w16cex="http://schemas.microsoft.com/office/word/2018/wordml/cex" xmlns:w16cid="http://schemas.microsoft.com/office/word/2016/wordml/cid" xmlns:w16="http://schemas.microsoft.com/office/word/2018/wordml" xmlns:w16du="http://schemas.microsoft.com/office/word/2023/wordml/word16du" xmlns:w16sdtdh="http://schemas.microsoft.com/office/word/2020/wordml/sdtdatahash" xmlns:w16sdtfl="http://schemas.microsoft.com/office/word/2024/wordml/sdtformatlock" xmlns:w16se="http://schemas.microsoft.com/office/word/2015/wordml/symex" xmlns:wpg="http://schemas.microsoft.com/office/word/2010/wordprocessingGroup" xmlns:wpi="http://schemas.microsoft.com/office/word/2010/wordprocessingInk" xmlns:wne="http://schemas.microsoft.com/office/word/2006/wordml" xmlns:wps="http://schemas.microsoft.com/office/word/2010/wordprocessingShape" mc:Ignorable="w14 w15 w16se w16cid w16 w16cex w16sdtdh w16sdtfl w16du wp14">
-  <w:abstractNum w:abstractNumId="0" w15:restartNumberingAfterBreak="0">
+<w:numbering xmlns:wpc="http://schemas.microsoft.com/office/word/2010/wordprocessingCanvas" xmlns:mc="http://schemas.openxmlformats.org/markup-compatibility/2006" xmlns:o="urn:schemas-microsoft-com:office:office" xmlns:r="http://schemas.openxmlformats.org/officeDocument/2006/relationships" xmlns:m="http://schemas.openxmlformats.org/officeDocument/2006/math" xmlns:v="urn:schemas-microsoft-com:vml" xmlns:wp14="http://schemas.microsoft.com/office/word/2010/wordprocessingDrawing" xmlns:wp="http://schemas.openxmlformats.org/drawingml/2006/wordprocessingDrawing" xmlns:w10="urn:schemas-microsoft-com:office:word" xmlns:w="http://schemas.openxmlformats.org/wordprocessingml/2006/main" xmlns:w14="http://schemas.microsoft.com/office/word/2010/wordml" xmlns:w15="http://schemas.microsoft.com/office/word/2012/wordml" xmlns:wpg="http://schemas.microsoft.com/office/word/2010/wordprocessingGroup" xmlns:wpi="http://schemas.microsoft.com/office/word/2010/wordprocessingInk" xmlns:wne="http://schemas.microsoft.com/office/word/2006/wordml" xmlns:wps="http://schemas.microsoft.com/office/word/2010/wordprocessingShape" mc:Ignorable="w14 w15 wp14">
+  <w:abstractNum w:abstractNumId="0">
     <w:nsid w:val="28767630"/>
     <w:multiLevelType w:val="hybridMultilevel"/>
     <w:tmpl w:val="DEA4B4AE"/>
@@ -2409,7 +2427,7 @@
       </w:pPr>
     </w:lvl>
   </w:abstractNum>
-  <w:abstractNum w:abstractNumId="1" w15:restartNumberingAfterBreak="0">
+  <w:abstractNum w:abstractNumId="1">
     <w:nsid w:val="3132756F"/>
     <w:multiLevelType w:val="hybridMultilevel"/>
     <w:tmpl w:val="FE7CA804"/>
@@ -2499,7 +2517,7 @@
       </w:pPr>
     </w:lvl>
   </w:abstractNum>
-  <w:abstractNum w:abstractNumId="2" w15:restartNumberingAfterBreak="0">
+  <w:abstractNum w:abstractNumId="2">
     <w:nsid w:val="552B0B50"/>
     <w:multiLevelType w:val="hybridMultilevel"/>
     <w:tmpl w:val="6C06B7CE"/>
@@ -2612,7 +2630,7 @@
       </w:pPr>
     </w:lvl>
   </w:abstractNum>
-  <w:abstractNum w:abstractNumId="3" w15:restartNumberingAfterBreak="0">
+  <w:abstractNum w:abstractNumId="3">
     <w:nsid w:val="74524F33"/>
     <w:multiLevelType w:val="hybridMultilevel"/>
     <w:tmpl w:val="43C679D8"/>
@@ -2702,23 +2720,23 @@
       </w:pPr>
     </w:lvl>
   </w:abstractNum>
-  <w:num w:numId="1" w16cid:durableId="1082289863">
+  <w:num w:numId="1">
     <w:abstractNumId w:val="2"/>
   </w:num>
-  <w:num w:numId="2" w16cid:durableId="1269001906">
+  <w:num w:numId="2">
     <w:abstractNumId w:val="3"/>
   </w:num>
-  <w:num w:numId="3" w16cid:durableId="912398067">
+  <w:num w:numId="3">
     <w:abstractNumId w:val="0"/>
   </w:num>
-  <w:num w:numId="4" w16cid:durableId="510484857">
+  <w:num w:numId="4">
     <w:abstractNumId w:val="1"/>
   </w:num>
 </w:numbering>
 </file>
 
 <file path=word/styles.xml><?xml version="1.0" encoding="utf-8"?>
-<w:styles xmlns:mc="http://schemas.openxmlformats.org/markup-compatibility/2006" xmlns:r="http://schemas.openxmlformats.org/officeDocument/2006/relationships" xmlns:w="http://schemas.openxmlformats.org/wordprocessingml/2006/main" xmlns:w14="http://schemas.microsoft.com/office/word/2010/wordml" xmlns:w15="http://schemas.microsoft.com/office/word/2012/wordml" xmlns:w16cex="http://schemas.microsoft.com/office/word/2018/wordml/cex" xmlns:w16cid="http://schemas.microsoft.com/office/word/2016/wordml/cid" xmlns:w16="http://schemas.microsoft.com/office/word/2018/wordml" xmlns:w16du="http://schemas.microsoft.com/office/word/2023/wordml/word16du" xmlns:w16sdtdh="http://schemas.microsoft.com/office/word/2020/wordml/sdtdatahash" xmlns:w16sdtfl="http://schemas.microsoft.com/office/word/2024/wordml/sdtformatlock" xmlns:w16se="http://schemas.microsoft.com/office/word/2015/wordml/symex" mc:Ignorable="w14 w15 w16se w16cid w16 w16cex w16sdtdh w16sdtfl w16du">
+<w:styles xmlns:mc="http://schemas.openxmlformats.org/markup-compatibility/2006" xmlns:r="http://schemas.openxmlformats.org/officeDocument/2006/relationships" xmlns:w="http://schemas.openxmlformats.org/wordprocessingml/2006/main" xmlns:w14="http://schemas.microsoft.com/office/word/2010/wordml" xmlns:w15="http://schemas.microsoft.com/office/word/2012/wordml" mc:Ignorable="w14 w15">
   <w:docDefaults>
     <w:rPrDefault>
       <w:rPr>
@@ -2728,7 +2746,7 @@
     </w:rPrDefault>
     <w:pPrDefault/>
   </w:docDefaults>
-  <w:latentStyles w:defLockedState="0" w:defUIPriority="0" w:defSemiHidden="0" w:defUnhideWhenUsed="0" w:defQFormat="0" w:count="376">
+  <w:latentStyles w:defLockedState="0" w:defUIPriority="0" w:defSemiHidden="0" w:defUnhideWhenUsed="0" w:defQFormat="0" w:count="371">
     <w:lsdException w:name="Normal" w:qFormat="1"/>
     <w:lsdException w:name="heading 1" w:qFormat="1"/>
     <w:lsdException w:name="heading 2" w:semiHidden="1" w:unhideWhenUsed="1" w:qFormat="1"/>
@@ -3003,11 +3021,6 @@
     <w:lsdException w:name="List Table 5 Dark Accent 6" w:uiPriority="50"/>
     <w:lsdException w:name="List Table 6 Colorful Accent 6" w:uiPriority="51"/>
     <w:lsdException w:name="List Table 7 Colorful Accent 6" w:uiPriority="52"/>
-    <w:lsdException w:name="Mention" w:semiHidden="1" w:uiPriority="99" w:unhideWhenUsed="1"/>
-    <w:lsdException w:name="Smart Hyperlink" w:semiHidden="1" w:uiPriority="99" w:unhideWhenUsed="1"/>
-    <w:lsdException w:name="Hashtag" w:semiHidden="1" w:uiPriority="99" w:unhideWhenUsed="1"/>
-    <w:lsdException w:name="Unresolved Mention" w:semiHidden="1" w:uiPriority="99" w:unhideWhenUsed="1"/>
-    <w:lsdException w:name="Smart Link" w:semiHidden="1" w:uiPriority="99" w:unhideWhenUsed="1"/>
   </w:latentStyles>
   <w:style w:type="paragraph" w:default="1" w:styleId="Normal">
     <w:name w:val="Normal"/>
@@ -3038,6 +3051,7 @@
   <w:style w:type="character" w:default="1" w:styleId="DefaultParagraphFont">
     <w:name w:val="Default Paragraph Font"/>
     <w:uiPriority w:val="1"/>
+    <w:semiHidden/>
     <w:unhideWhenUsed/>
   </w:style>
   <w:style w:type="table" w:default="1" w:styleId="TableNormal">
@@ -3102,6 +3116,7 @@
     <w:basedOn w:val="TableNormal"/>
     <w:rsid w:val="002C1F1B"/>
     <w:tblPr>
+      <w:tblInd w:w="0" w:type="dxa"/>
       <w:tblBorders>
         <w:top w:val="single" w:sz="4" w:space="0" w:color="auto"/>
         <w:left w:val="single" w:sz="4" w:space="0" w:color="auto"/>
@@ -3110,6 +3125,12 @@
         <w:insideH w:val="single" w:sz="4" w:space="0" w:color="auto"/>
         <w:insideV w:val="single" w:sz="4" w:space="0" w:color="auto"/>
       </w:tblBorders>
+      <w:tblCellMar>
+        <w:top w:w="0" w:type="dxa"/>
+        <w:left w:w="108" w:type="dxa"/>
+        <w:bottom w:w="0" w:type="dxa"/>
+        <w:right w:w="108" w:type="dxa"/>
+      </w:tblCellMar>
     </w:tblPr>
   </w:style>
   <w:style w:type="paragraph" w:styleId="BalloonText">

</xml_diff>